<commit_message>
Record pending source review limits in manuscript and refresh release
</commit_message>
<xml_diff>
--- a/results/paper/substantial_revision_20261023_01/年报与法规双源RAG_大幅修订研究长稿.docx
+++ b/results/paper/substantial_revision_20261023_01/年报与法规双源RAG_大幅修订研究长稿.docx
@@ -21765,6 +21765,14 @@
       </w:pPr>
       <w:r>
         <w:t>补充的法规版本审计发现，本研究问题均以2024年报告为背景，而当前知识库中的DOC100《上市公司信息披露管理办法》、DOC128《上市公司章程指引》和DOC120《上市公司治理准则》分别对应2025年第226号令、2025年第6号公告版和自2026年起施行的2025年第18号公告版；较早的第182号令、2023年修订文本和2018年版未作为相应历史版本独立纳入索引[25–27]。按清单日期检查冻结的法规top-10候选，G1合库检索的73条法规候选中有64条晚于报告年度，涉及42/60题；G2双路检索的300条中有156条晚于报告年度，涉及60/60题。日期字段只提示版本时间风险，不单独证明某条规范对具体事项不适用。因此，涉及这些文件的检索与评分只反映当前语料快照，不能解释为2024年历史法规版本命中率或时点合规性验证。</w:t>
+      </w:r>
+    </w:p>
+    <w:p>
+      <w:pPr>
+        <w:widowControl/>
+      </w:pPr>
+      <w:r>
+        <w:t>此外，截至2026年10月27日，两份法规来源版本复核提交已通过结构校验，但92项字段差异仍待仲裁，接受标签为0；审阅人身份未认证，盲审状态未获验证。这些提交未用于更新知识库版本元数据，也不构成法规时点适用性的独立验证证据。</w:t>
       </w:r>
     </w:p>
     <w:p>

</xml_diff>